<commit_message>
237 corrección errores review sprint 3 (#239)
* Corrección de errores del sprint 3

* Corrección de plan de pruebas
</commit_message>
<xml_diff>
--- a/req/Plan de Pruebas (1).docx
+++ b/req/Plan de Pruebas (1).docx
@@ -2863,28 +2863,14 @@
           <w:lang w:val="es-ES"/>
         </w:rPr>
       </w:pPr>
-      <w:r>
-        <w:lastRenderedPageBreak/>
-        <w:fldChar w:fldCharType="begin"/>
-      </w:r>
-      <w:r>
-        <w:instrText xml:space="preserve"> TITLE  \* MERGEFORMAT </w:instrText>
-      </w:r>
-      <w:r>
-        <w:fldChar w:fldCharType="separate"/>
-      </w:r>
-      <w:r>
-        <w:rPr>
-          <w:lang w:val="es-ES"/>
-        </w:rPr>
-        <w:t>Plan de Pruebas</w:t>
-      </w:r>
-      <w:r>
-        <w:rPr>
-          <w:lang w:val="es-ES"/>
-        </w:rPr>
-        <w:fldChar w:fldCharType="end"/>
-      </w:r>
+      <w:fldSimple w:instr=" TITLE  \* MERGEFORMAT ">
+        <w:r>
+          <w:rPr>
+            <w:lang w:val="es-ES"/>
+          </w:rPr>
+          <w:t>Plan de Pruebas</w:t>
+        </w:r>
+      </w:fldSimple>
     </w:p>
     <w:p>
       <w:pPr>
@@ -3387,13 +3373,7 @@
         <w:rPr>
           <w:lang w:val="es-ES"/>
         </w:rPr>
-        <w:t>m</w:t>
-      </w:r>
-      <w:r>
-        <w:rPr>
-          <w:lang w:val="es-ES"/>
-        </w:rPr>
-        <w:t>arca</w:t>
+        <w:t>marca</w:t>
       </w:r>
       <w:r>
         <w:rPr>
@@ -3495,19 +3475,7 @@
         <w:rPr>
           <w:lang w:val="es-ES"/>
         </w:rPr>
-        <w:t>de la reseña</w:t>
-      </w:r>
-      <w:r>
-        <w:rPr>
-          <w:lang w:val="es-ES"/>
-        </w:rPr>
-        <w:t>, mostrando detalles de est</w:t>
-      </w:r>
-      <w:r>
-        <w:rPr>
-          <w:lang w:val="es-ES"/>
-        </w:rPr>
-        <w:t>a</w:t>
+        <w:t>de la reseña, mostrando detalles de esta</w:t>
       </w:r>
       <w:r>
         <w:rPr>
@@ -4307,37 +4275,37 @@
         <w:rPr>
           <w:lang w:val="es-ES"/>
         </w:rPr>
-        <w:t>Ejecución manual de los casos de pruebas (CU</w:t>
-      </w:r>
-      <w:r>
-        <w:rPr>
-          <w:lang w:val="es-ES"/>
-        </w:rPr>
-        <w:t>2</w:t>
-      </w:r>
-      <w:r>
-        <w:rPr>
-          <w:lang w:val="es-ES"/>
-        </w:rPr>
-        <w:t>_1 a CU</w:t>
-      </w:r>
-      <w:r>
-        <w:rPr>
-          <w:lang w:val="es-ES"/>
-        </w:rPr>
-        <w:t>2</w:t>
-      </w:r>
-      <w:r>
-        <w:rPr>
-          <w:lang w:val="es-ES"/>
-        </w:rPr>
-        <w:t>_1</w:t>
-      </w:r>
-      <w:r>
-        <w:rPr>
-          <w:lang w:val="es-ES"/>
-        </w:rPr>
-        <w:t>4</w:t>
+        <w:t>Ejecución manual de los casos de pruebas (CU_</w:t>
+      </w:r>
+      <w:r>
+        <w:rPr>
+          <w:lang w:val="es-ES"/>
+        </w:rPr>
+        <w:t>Rev_1</w:t>
+      </w:r>
+      <w:r>
+        <w:rPr>
+          <w:lang w:val="es-ES"/>
+        </w:rPr>
+        <w:t xml:space="preserve"> a CU_</w:t>
+      </w:r>
+      <w:r>
+        <w:rPr>
+          <w:lang w:val="es-ES"/>
+        </w:rPr>
+        <w:t>Rev_</w:t>
+      </w:r>
+      <w:r>
+        <w:rPr>
+          <w:lang w:val="es-ES"/>
+        </w:rPr>
+        <w:t>1</w:t>
+      </w:r>
+      <w:r>
+        <w:rPr>
+          <w:lang w:val="es-ES"/>
+        </w:rPr>
+        <w:t>6</w:t>
       </w:r>
       <w:r>
         <w:rPr>
@@ -5442,21 +5410,11 @@
             </w:rPr>
             <w:t>Ó</w:t>
           </w:r>
-          <w:r>
-            <w:fldChar w:fldCharType="begin"/>
-          </w:r>
-          <w:r>
-            <w:instrText xml:space="preserve"> DOCPROPERTY "Company"  \* MERGEFORMAT </w:instrText>
-          </w:r>
-          <w:r>
-            <w:fldChar w:fldCharType="separate"/>
-          </w:r>
-          <w:r>
-            <w:t>&lt;Company Name&gt;</w:t>
-          </w:r>
-          <w:r>
-            <w:fldChar w:fldCharType="end"/>
-          </w:r>
+          <w:fldSimple w:instr=" DOCPROPERTY &quot;Company&quot;  \* MERGEFORMAT ">
+            <w:r>
+              <w:t>&lt;Company Name&gt;</w:t>
+            </w:r>
+          </w:fldSimple>
           <w:r>
             <w:t>, 2000</w:t>
           </w:r>
@@ -8222,15 +8180,6 @@
 </file>
 
 <file path=customXml/item1.xml><?xml version="1.0" encoding="utf-8"?>
-<?mso-contentType ?>
-<FormTemplates xmlns="http://schemas.microsoft.com/sharepoint/v3/contenttype/forms">
-  <Display>DocumentLibraryForm</Display>
-  <Edit>DocumentLibraryForm</Edit>
-  <New>DocumentLibraryForm</New>
-</FormTemplates>
-</file>
-
-<file path=customXml/item2.xml><?xml version="1.0" encoding="utf-8"?>
 <ct:contentTypeSchema xmlns:ct="http://schemas.microsoft.com/office/2006/metadata/contentType" xmlns:ma="http://schemas.microsoft.com/office/2006/metadata/properties/metaAttributes" ct:_="" ma:_="" ma:contentTypeName="Documento" ma:contentTypeID="0x010100A84EB69FEAAC124494464A843FB65F1B" ma:contentTypeVersion="15" ma:contentTypeDescription="Crear nuevo documento." ma:contentTypeScope="" ma:versionID="1640012617edff0de1b425616c9fe0b9">
   <xsd:schema xmlns:xsd="http://www.w3.org/2001/XMLSchema" xmlns:xs="http://www.w3.org/2001/XMLSchema" xmlns:p="http://schemas.microsoft.com/office/2006/metadata/properties" xmlns:ns2="e70db583-0384-45f2-bee4-d71087a4ae97" xmlns:ns3="d6169a53-58c7-4834-a922-92accc0d3c74" targetNamespace="http://schemas.microsoft.com/office/2006/metadata/properties" ma:root="true" ma:fieldsID="07db4f0170a8a23d5fd96252d775c9ce" ns2:_="" ns3:_="">
     <xsd:import namespace="e70db583-0384-45f2-bee4-d71087a4ae97"/>
@@ -8467,15 +8416,16 @@
 </ct:contentTypeSchema>
 </file>
 
-<file path=customXml/itemProps1.xml><?xml version="1.0" encoding="utf-8"?>
-<ds:datastoreItem xmlns:ds="http://schemas.openxmlformats.org/officeDocument/2006/customXml" ds:itemID="{28618440-9741-4A85-8383-ED2D768AAC91}">
-  <ds:schemaRefs>
-    <ds:schemaRef ds:uri="http://schemas.microsoft.com/sharepoint/v3/contenttype/forms"/>
-  </ds:schemaRefs>
-</ds:datastoreItem>
+<file path=customXml/item2.xml><?xml version="1.0" encoding="utf-8"?>
+<?mso-contentType ?>
+<FormTemplates xmlns="http://schemas.microsoft.com/sharepoint/v3/contenttype/forms">
+  <Display>DocumentLibraryForm</Display>
+  <Edit>DocumentLibraryForm</Edit>
+  <New>DocumentLibraryForm</New>
+</FormTemplates>
 </file>
 
-<file path=customXml/itemProps2.xml><?xml version="1.0" encoding="utf-8"?>
+<file path=customXml/itemProps1.xml><?xml version="1.0" encoding="utf-8"?>
 <ds:datastoreItem xmlns:ds="http://schemas.openxmlformats.org/officeDocument/2006/customXml" ds:itemID="{9948394E-78DD-4969-B9D1-4268901C028F}">
   <ds:schemaRefs>
     <ds:schemaRef ds:uri="http://schemas.microsoft.com/office/2006/metadata/contentType"/>
@@ -8492,4 +8442,12 @@
     <ds:schemaRef ds:uri="http://schemas.microsoft.com/internal/obd"/>
   </ds:schemaRefs>
 </ds:datastoreItem>
+</file>
+
+<file path=customXml/itemProps2.xml><?xml version="1.0" encoding="utf-8"?>
+<ds:datastoreItem xmlns:ds="http://schemas.openxmlformats.org/officeDocument/2006/customXml" ds:itemID="{28618440-9741-4A85-8383-ED2D768AAC91}">
+  <ds:schemaRefs>
+    <ds:schemaRef ds:uri="http://schemas.microsoft.com/sharepoint/v3/contenttype/forms"/>
+  </ds:schemaRefs>
+</ds:datastoreItem>
 </file>
</xml_diff>

<commit_message>
Corrección de plan de pruebas
</commit_message>
<xml_diff>
--- a/req/Plan de Pruebas (1).docx
+++ b/req/Plan de Pruebas (1).docx
@@ -2863,28 +2863,14 @@
           <w:lang w:val="es-ES"/>
         </w:rPr>
       </w:pPr>
-      <w:r>
-        <w:lastRenderedPageBreak/>
-        <w:fldChar w:fldCharType="begin"/>
-      </w:r>
-      <w:r>
-        <w:instrText xml:space="preserve"> TITLE  \* MERGEFORMAT </w:instrText>
-      </w:r>
-      <w:r>
-        <w:fldChar w:fldCharType="separate"/>
-      </w:r>
-      <w:r>
-        <w:rPr>
-          <w:lang w:val="es-ES"/>
-        </w:rPr>
-        <w:t>Plan de Pruebas</w:t>
-      </w:r>
-      <w:r>
-        <w:rPr>
-          <w:lang w:val="es-ES"/>
-        </w:rPr>
-        <w:fldChar w:fldCharType="end"/>
-      </w:r>
+      <w:fldSimple w:instr=" TITLE  \* MERGEFORMAT ">
+        <w:r>
+          <w:rPr>
+            <w:lang w:val="es-ES"/>
+          </w:rPr>
+          <w:t>Plan de Pruebas</w:t>
+        </w:r>
+      </w:fldSimple>
     </w:p>
     <w:p>
       <w:pPr>
@@ -3387,13 +3373,7 @@
         <w:rPr>
           <w:lang w:val="es-ES"/>
         </w:rPr>
-        <w:t>m</w:t>
-      </w:r>
-      <w:r>
-        <w:rPr>
-          <w:lang w:val="es-ES"/>
-        </w:rPr>
-        <w:t>arca</w:t>
+        <w:t>marca</w:t>
       </w:r>
       <w:r>
         <w:rPr>
@@ -3495,19 +3475,7 @@
         <w:rPr>
           <w:lang w:val="es-ES"/>
         </w:rPr>
-        <w:t>de la reseña</w:t>
-      </w:r>
-      <w:r>
-        <w:rPr>
-          <w:lang w:val="es-ES"/>
-        </w:rPr>
-        <w:t>, mostrando detalles de est</w:t>
-      </w:r>
-      <w:r>
-        <w:rPr>
-          <w:lang w:val="es-ES"/>
-        </w:rPr>
-        <w:t>a</w:t>
+        <w:t>de la reseña, mostrando detalles de esta</w:t>
       </w:r>
       <w:r>
         <w:rPr>
@@ -4307,37 +4275,37 @@
         <w:rPr>
           <w:lang w:val="es-ES"/>
         </w:rPr>
-        <w:t>Ejecución manual de los casos de pruebas (CU</w:t>
-      </w:r>
-      <w:r>
-        <w:rPr>
-          <w:lang w:val="es-ES"/>
-        </w:rPr>
-        <w:t>2</w:t>
-      </w:r>
-      <w:r>
-        <w:rPr>
-          <w:lang w:val="es-ES"/>
-        </w:rPr>
-        <w:t>_1 a CU</w:t>
-      </w:r>
-      <w:r>
-        <w:rPr>
-          <w:lang w:val="es-ES"/>
-        </w:rPr>
-        <w:t>2</w:t>
-      </w:r>
-      <w:r>
-        <w:rPr>
-          <w:lang w:val="es-ES"/>
-        </w:rPr>
-        <w:t>_1</w:t>
-      </w:r>
-      <w:r>
-        <w:rPr>
-          <w:lang w:val="es-ES"/>
-        </w:rPr>
-        <w:t>4</w:t>
+        <w:t>Ejecución manual de los casos de pruebas (CU_</w:t>
+      </w:r>
+      <w:r>
+        <w:rPr>
+          <w:lang w:val="es-ES"/>
+        </w:rPr>
+        <w:t>Rev_1</w:t>
+      </w:r>
+      <w:r>
+        <w:rPr>
+          <w:lang w:val="es-ES"/>
+        </w:rPr>
+        <w:t xml:space="preserve"> a CU_</w:t>
+      </w:r>
+      <w:r>
+        <w:rPr>
+          <w:lang w:val="es-ES"/>
+        </w:rPr>
+        <w:t>Rev_</w:t>
+      </w:r>
+      <w:r>
+        <w:rPr>
+          <w:lang w:val="es-ES"/>
+        </w:rPr>
+        <w:t>1</w:t>
+      </w:r>
+      <w:r>
+        <w:rPr>
+          <w:lang w:val="es-ES"/>
+        </w:rPr>
+        <w:t>6</w:t>
       </w:r>
       <w:r>
         <w:rPr>
@@ -5442,21 +5410,11 @@
             </w:rPr>
             <w:t>Ó</w:t>
           </w:r>
-          <w:r>
-            <w:fldChar w:fldCharType="begin"/>
-          </w:r>
-          <w:r>
-            <w:instrText xml:space="preserve"> DOCPROPERTY "Company"  \* MERGEFORMAT </w:instrText>
-          </w:r>
-          <w:r>
-            <w:fldChar w:fldCharType="separate"/>
-          </w:r>
-          <w:r>
-            <w:t>&lt;Company Name&gt;</w:t>
-          </w:r>
-          <w:r>
-            <w:fldChar w:fldCharType="end"/>
-          </w:r>
+          <w:fldSimple w:instr=" DOCPROPERTY &quot;Company&quot;  \* MERGEFORMAT ">
+            <w:r>
+              <w:t>&lt;Company Name&gt;</w:t>
+            </w:r>
+          </w:fldSimple>
           <w:r>
             <w:t>, 2000</w:t>
           </w:r>
@@ -8222,15 +8180,6 @@
 </file>
 
 <file path=customXml/item1.xml><?xml version="1.0" encoding="utf-8"?>
-<?mso-contentType ?>
-<FormTemplates xmlns="http://schemas.microsoft.com/sharepoint/v3/contenttype/forms">
-  <Display>DocumentLibraryForm</Display>
-  <Edit>DocumentLibraryForm</Edit>
-  <New>DocumentLibraryForm</New>
-</FormTemplates>
-</file>
-
-<file path=customXml/item2.xml><?xml version="1.0" encoding="utf-8"?>
 <ct:contentTypeSchema xmlns:ct="http://schemas.microsoft.com/office/2006/metadata/contentType" xmlns:ma="http://schemas.microsoft.com/office/2006/metadata/properties/metaAttributes" ct:_="" ma:_="" ma:contentTypeName="Documento" ma:contentTypeID="0x010100A84EB69FEAAC124494464A843FB65F1B" ma:contentTypeVersion="15" ma:contentTypeDescription="Crear nuevo documento." ma:contentTypeScope="" ma:versionID="1640012617edff0de1b425616c9fe0b9">
   <xsd:schema xmlns:xsd="http://www.w3.org/2001/XMLSchema" xmlns:xs="http://www.w3.org/2001/XMLSchema" xmlns:p="http://schemas.microsoft.com/office/2006/metadata/properties" xmlns:ns2="e70db583-0384-45f2-bee4-d71087a4ae97" xmlns:ns3="d6169a53-58c7-4834-a922-92accc0d3c74" targetNamespace="http://schemas.microsoft.com/office/2006/metadata/properties" ma:root="true" ma:fieldsID="07db4f0170a8a23d5fd96252d775c9ce" ns2:_="" ns3:_="">
     <xsd:import namespace="e70db583-0384-45f2-bee4-d71087a4ae97"/>
@@ -8467,15 +8416,16 @@
 </ct:contentTypeSchema>
 </file>
 
-<file path=customXml/itemProps1.xml><?xml version="1.0" encoding="utf-8"?>
-<ds:datastoreItem xmlns:ds="http://schemas.openxmlformats.org/officeDocument/2006/customXml" ds:itemID="{28618440-9741-4A85-8383-ED2D768AAC91}">
-  <ds:schemaRefs>
-    <ds:schemaRef ds:uri="http://schemas.microsoft.com/sharepoint/v3/contenttype/forms"/>
-  </ds:schemaRefs>
-</ds:datastoreItem>
+<file path=customXml/item2.xml><?xml version="1.0" encoding="utf-8"?>
+<?mso-contentType ?>
+<FormTemplates xmlns="http://schemas.microsoft.com/sharepoint/v3/contenttype/forms">
+  <Display>DocumentLibraryForm</Display>
+  <Edit>DocumentLibraryForm</Edit>
+  <New>DocumentLibraryForm</New>
+</FormTemplates>
 </file>
 
-<file path=customXml/itemProps2.xml><?xml version="1.0" encoding="utf-8"?>
+<file path=customXml/itemProps1.xml><?xml version="1.0" encoding="utf-8"?>
 <ds:datastoreItem xmlns:ds="http://schemas.openxmlformats.org/officeDocument/2006/customXml" ds:itemID="{9948394E-78DD-4969-B9D1-4268901C028F}">
   <ds:schemaRefs>
     <ds:schemaRef ds:uri="http://schemas.microsoft.com/office/2006/metadata/contentType"/>
@@ -8492,4 +8442,12 @@
     <ds:schemaRef ds:uri="http://schemas.microsoft.com/internal/obd"/>
   </ds:schemaRefs>
 </ds:datastoreItem>
+</file>
+
+<file path=customXml/itemProps2.xml><?xml version="1.0" encoding="utf-8"?>
+<ds:datastoreItem xmlns:ds="http://schemas.openxmlformats.org/officeDocument/2006/customXml" ds:itemID="{28618440-9741-4A85-8383-ED2D768AAC91}">
+  <ds:schemaRefs>
+    <ds:schemaRef ds:uri="http://schemas.microsoft.com/sharepoint/v3/contenttype/forms"/>
+  </ds:schemaRefs>
+</ds:datastoreItem>
 </file>
</xml_diff>